<commit_message>
Final submission: Polished report, added visuals, and cleaned up scripts
</commit_message>
<xml_diff>
--- a/Final_Project_Report.docx
+++ b/Final_Project_Report.docx
@@ -908,7 +908,7 @@
         <w:t xml:space="preserve"> </w:t>
       </w:r>
       <w:r>
-        <w:t xml:space="preserve">Categorical tags were converted into numerical data using</w:t>
+        <w:t xml:space="preserve">Categorical tags (Length, Color, Design, Shape) were converted into numerical vectors using</w:t>
       </w:r>
       <w:r>
         <w:t xml:space="preserve"> </w:t>
@@ -921,7 +921,40 @@
         <w:t xml:space="preserve">One-Hot Encoding</w:t>
       </w:r>
       <w:r>
-        <w:t xml:space="preserve">.</w:t>
+        <w:t xml:space="preserve">. This process expanded the sparse feature space, allowing the model to treat each attribute (e.g.,</w:t>
+      </w:r>
+      <w:r>
+        <w:t xml:space="preserve"> </w:t>
+      </w:r>
+      <w:r>
+        <w:t xml:space="preserve">“</w:t>
+      </w:r>
+      <w:r>
+        <w:t xml:space="preserve">nude</w:t>
+      </w:r>
+      <w:r>
+        <w:t xml:space="preserve">”</w:t>
+      </w:r>
+      <w:r>
+        <w:t xml:space="preserve"> </w:t>
+      </w:r>
+      <w:r>
+        <w:t xml:space="preserve">or</w:t>
+      </w:r>
+      <w:r>
+        <w:t xml:space="preserve"> </w:t>
+      </w:r>
+      <w:r>
+        <w:t xml:space="preserve">“</w:t>
+      </w:r>
+      <w:r>
+        <w:t xml:space="preserve">matte</w:t>
+      </w:r>
+      <w:r>
+        <w:t xml:space="preserve">”</w:t>
+      </w:r>
+      <w:r>
+        <w:t xml:space="preserve">) as an independent dimension.</w:t>
       </w:r>
     </w:p>
     <w:p>
@@ -959,7 +992,19 @@
         <w:t xml:space="preserve"> </w:t>
       </w:r>
       <w:r>
-        <w:t xml:space="preserve">(via Scikit-Learn).</w:t>
+        <w:t xml:space="preserve">(via Scikit-Learn’s</w:t>
+      </w:r>
+      <w:r>
+        <w:t xml:space="preserve"> </w:t>
+      </w:r>
+      <w:r>
+        <w:rPr>
+          <w:rStyle w:val="VerbatimChar"/>
+        </w:rPr>
+        <w:t xml:space="preserve">SVC</w:t>
+      </w:r>
+      <w:r>
+        <w:t xml:space="preserve">). The linear kernel was chosen to find the optimal separating hyperplane in the high-dimensional tag space while maintaining high interpretability.</w:t>
       </w:r>
     </w:p>
     <w:p>
@@ -975,13 +1020,51 @@
           <w:bCs/>
           <w:b/>
         </w:rPr>
+        <w:t xml:space="preserve">Implementation Details:</w:t>
+      </w:r>
+      <w:r>
+        <w:t xml:space="preserve"> </w:t>
+      </w:r>
+      <w:r>
+        <w:t xml:space="preserve">The model was trained with probability estimation enabled to allow for AUROC calculation. To ensure the results were not due to an advantageous data split, I used</w:t>
+      </w:r>
+      <w:r>
+        <w:t xml:space="preserve"> </w:t>
+      </w:r>
+      <w:r>
+        <w:rPr>
+          <w:bCs/>
+          <w:b/>
+        </w:rPr>
+        <w:t xml:space="preserve">5-Fold Cross-Validation</w:t>
+      </w:r>
+      <w:r>
+        <w:t xml:space="preserve"> </w:t>
+      </w:r>
+      <w:r>
+        <w:t xml:space="preserve">to assess the model’s stability across the entire dataset.</w:t>
+      </w:r>
+    </w:p>
+    <w:p>
+      <w:pPr>
+        <w:numPr>
+          <w:ilvl w:val="0"/>
+          <w:numId w:val="1007"/>
+        </w:numPr>
+        <w:pStyle w:val="Compact"/>
+      </w:pPr>
+      <w:r>
+        <w:rPr>
+          <w:bCs/>
+          <w:b/>
+        </w:rPr>
         <w:t xml:space="preserve">Rationale:</w:t>
       </w:r>
       <w:r>
         <w:t xml:space="preserve"> </w:t>
       </w:r>
       <w:r>
-        <w:t xml:space="preserve">The linear kernel allows for</w:t>
+        <w:t xml:space="preserve">The linear kernel allows for direct</w:t>
       </w:r>
       <w:r>
         <w:t xml:space="preserve"> </w:t>
@@ -999,7 +1082,7 @@
         <w:t xml:space="preserve"> </w:t>
       </w:r>
       <w:r>
-        <w:t xml:space="preserve">analysis, revealing which specific descriptors drive the preference model.</w:t>
+        <w:t xml:space="preserve">analysis by extracting the mathematical weights (coefficients) assigned to each one-hot encoded tag, revealing exactly which attributes drive the preference model.</w:t>
       </w:r>
     </w:p>
     <w:bookmarkEnd w:id="33"/>
@@ -1031,7 +1114,7 @@
         <w:t xml:space="preserve"> </w:t>
       </w:r>
       <w:r>
-        <w:t xml:space="preserve">ResNet-18 (via PyTorch).</w:t>
+        <w:t xml:space="preserve">ResNet-18 architecture implemented via PyTorch.</w:t>
       </w:r>
     </w:p>
     <w:p>
@@ -1047,13 +1130,13 @@
           <w:bCs/>
           <w:b/>
         </w:rPr>
-        <w:t xml:space="preserve">Transfer Learning:</w:t>
-      </w:r>
-      <w:r>
-        <w:t xml:space="preserve"> </w:t>
-      </w:r>
-      <w:r>
-        <w:t xml:space="preserve">Used weights pre-trained on ImageNet and</w:t>
+        <w:t xml:space="preserve">Preprocessing &amp; Augmentation:</w:t>
+      </w:r>
+      <w:r>
+        <w:t xml:space="preserve"> </w:t>
+      </w:r>
+      <w:r>
+        <w:t xml:space="preserve">Images were resized to</w:t>
       </w:r>
       <w:r>
         <w:t xml:space="preserve"> </w:t>
@@ -1063,13 +1146,156 @@
           <w:bCs/>
           <w:b/>
         </w:rPr>
-        <w:t xml:space="preserve">unfroze the final residual block (layer4)</w:t>
-      </w:r>
-      <w:r>
-        <w:t xml:space="preserve"> </w:t>
-      </w:r>
-      <w:r>
-        <w:t xml:space="preserve">of the ResNet.</w:t>
+        <w:t xml:space="preserve">224x224 pixels</w:t>
+      </w:r>
+      <w:r>
+        <w:t xml:space="preserve"> </w:t>
+      </w:r>
+      <w:r>
+        <w:t xml:space="preserve">and normalized using ImageNet mean and standard deviation. To prevent overfitting on the small dataset, I applied</w:t>
+      </w:r>
+      <w:r>
+        <w:t xml:space="preserve"> </w:t>
+      </w:r>
+      <w:r>
+        <w:rPr>
+          <w:bCs/>
+          <w:b/>
+        </w:rPr>
+        <w:t xml:space="preserve">Data Augmentation</w:t>
+      </w:r>
+      <w:r>
+        <w:t xml:space="preserve">, including random horizontal flips and random rotations up to 20 degrees.</w:t>
+      </w:r>
+    </w:p>
+    <w:p>
+      <w:pPr>
+        <w:numPr>
+          <w:ilvl w:val="0"/>
+          <w:numId w:val="1008"/>
+        </w:numPr>
+        <w:pStyle w:val="Compact"/>
+      </w:pPr>
+      <w:r>
+        <w:rPr>
+          <w:bCs/>
+          <w:b/>
+        </w:rPr>
+        <w:t xml:space="preserve">Architecture Modification:</w:t>
+      </w:r>
+      <w:r>
+        <w:t xml:space="preserve"> </w:t>
+      </w:r>
+      <w:r>
+        <w:t xml:space="preserve">I utilized</w:t>
+      </w:r>
+      <w:r>
+        <w:t xml:space="preserve"> </w:t>
+      </w:r>
+      <w:r>
+        <w:rPr>
+          <w:bCs/>
+          <w:b/>
+        </w:rPr>
+        <w:t xml:space="preserve">Transfer Learning</w:t>
+      </w:r>
+      <w:r>
+        <w:t xml:space="preserve"> </w:t>
+      </w:r>
+      <w:r>
+        <w:t xml:space="preserve">with weights pre-trained on ImageNet. The original 1000-class fully connected head was replaced with a new linear layer consisting of 2 output nodes (Yes/No).</w:t>
+      </w:r>
+    </w:p>
+    <w:p>
+      <w:pPr>
+        <w:numPr>
+          <w:ilvl w:val="0"/>
+          <w:numId w:val="1008"/>
+        </w:numPr>
+        <w:pStyle w:val="Compact"/>
+      </w:pPr>
+      <w:r>
+        <w:rPr>
+          <w:bCs/>
+          <w:b/>
+        </w:rPr>
+        <w:t xml:space="preserve">Fine-Tuning Strategy:</w:t>
+      </w:r>
+      <w:r>
+        <w:t xml:space="preserve"> </w:t>
+      </w:r>
+      <w:r>
+        <w:t xml:space="preserve">I employed a partial freezing strategy where the early convolutional layers were frozen to retain general visual knowledge (edges, textures), while the</w:t>
+      </w:r>
+      <w:r>
+        <w:t xml:space="preserve"> </w:t>
+      </w:r>
+      <w:r>
+        <w:rPr>
+          <w:bCs/>
+          <w:b/>
+        </w:rPr>
+        <w:t xml:space="preserve">final residual block (layer4)</w:t>
+      </w:r>
+      <w:r>
+        <w:t xml:space="preserve"> </w:t>
+      </w:r>
+      <w:r>
+        <w:t xml:space="preserve">and the classification head were unfrozen for domain-specific fine-tuning.</w:t>
+      </w:r>
+    </w:p>
+    <w:p>
+      <w:pPr>
+        <w:numPr>
+          <w:ilvl w:val="0"/>
+          <w:numId w:val="1008"/>
+        </w:numPr>
+        <w:pStyle w:val="Compact"/>
+      </w:pPr>
+      <w:r>
+        <w:rPr>
+          <w:bCs/>
+          <w:b/>
+        </w:rPr>
+        <w:t xml:space="preserve">Training Setup:</w:t>
+      </w:r>
+      <w:r>
+        <w:t xml:space="preserve"> </w:t>
+      </w:r>
+      <w:r>
+        <w:t xml:space="preserve">The model was optimized using</w:t>
+      </w:r>
+      <w:r>
+        <w:t xml:space="preserve"> </w:t>
+      </w:r>
+      <w:r>
+        <w:rPr>
+          <w:bCs/>
+          <w:b/>
+        </w:rPr>
+        <w:t xml:space="preserve">Stochastic Gradient Descent (SGD)</w:t>
+      </w:r>
+      <w:r>
+        <w:t xml:space="preserve"> </w:t>
+      </w:r>
+      <w:r>
+        <w:t xml:space="preserve">with a momentum of 0.9 and a learning rate of 0.001, minimizing</w:t>
+      </w:r>
+      <w:r>
+        <w:t xml:space="preserve"> </w:t>
+      </w:r>
+      <w:r>
+        <w:rPr>
+          <w:bCs/>
+          <w:b/>
+        </w:rPr>
+        <w:t xml:space="preserve">Cross-Entropy Loss</w:t>
+      </w:r>
+      <w:r>
+        <w:t xml:space="preserve"> </w:t>
+      </w:r>
+      <w:r>
+        <w:t xml:space="preserve">over 12 epochs.</w:t>
       </w:r>
     </w:p>
     <w:p>

</xml_diff>